<commit_message>
Added explicit WEEE Grant entry
</commit_message>
<xml_diff>
--- a/Master_Resume.docx
+++ b/Master_Resume.docx
@@ -252,7 +252,7 @@
         <w:pStyle w:val="ListParagraph"/>
         <w:numPr>
           <w:ilvl w:val="0"/>
-          <w:numId w:val="3"/>
+          <w:numId w:val="4"/>
         </w:numPr>
         <w:spacing w:before="0" w:after="60"/>
         <w:rPr/>
@@ -271,7 +271,7 @@
         <w:pStyle w:val="ListParagraph"/>
         <w:numPr>
           <w:ilvl w:val="0"/>
-          <w:numId w:val="1"/>
+          <w:numId w:val="2"/>
         </w:numPr>
         <w:spacing w:before="0" w:after="60"/>
         <w:rPr/>
@@ -290,7 +290,7 @@
         <w:pStyle w:val="ListParagraph"/>
         <w:numPr>
           <w:ilvl w:val="0"/>
-          <w:numId w:val="1"/>
+          <w:numId w:val="2"/>
         </w:numPr>
         <w:spacing w:before="0" w:after="60"/>
         <w:rPr/>
@@ -361,7 +361,7 @@
         <w:pStyle w:val="ListParagraph"/>
         <w:numPr>
           <w:ilvl w:val="0"/>
-          <w:numId w:val="1"/>
+          <w:numId w:val="2"/>
         </w:numPr>
         <w:spacing w:before="0" w:after="60"/>
         <w:rPr/>
@@ -380,7 +380,7 @@
         <w:pStyle w:val="ListParagraph"/>
         <w:numPr>
           <w:ilvl w:val="0"/>
-          <w:numId w:val="1"/>
+          <w:numId w:val="2"/>
         </w:numPr>
         <w:spacing w:before="0" w:after="60"/>
         <w:rPr/>
@@ -399,7 +399,7 @@
         <w:pStyle w:val="ListParagraph"/>
         <w:numPr>
           <w:ilvl w:val="0"/>
-          <w:numId w:val="1"/>
+          <w:numId w:val="2"/>
         </w:numPr>
         <w:spacing w:before="0" w:after="60"/>
         <w:rPr/>
@@ -491,7 +491,7 @@
         <w:pStyle w:val="ListParagraph"/>
         <w:numPr>
           <w:ilvl w:val="0"/>
-          <w:numId w:val="1"/>
+          <w:numId w:val="2"/>
         </w:numPr>
         <w:spacing w:before="0" w:after="60"/>
         <w:rPr/>
@@ -510,7 +510,7 @@
         <w:pStyle w:val="ListParagraph"/>
         <w:numPr>
           <w:ilvl w:val="0"/>
-          <w:numId w:val="1"/>
+          <w:numId w:val="2"/>
         </w:numPr>
         <w:spacing w:before="0" w:after="60"/>
         <w:rPr/>
@@ -529,7 +529,7 @@
         <w:pStyle w:val="ListParagraph"/>
         <w:numPr>
           <w:ilvl w:val="0"/>
-          <w:numId w:val="1"/>
+          <w:numId w:val="2"/>
         </w:numPr>
         <w:spacing w:before="0" w:after="60"/>
         <w:rPr/>
@@ -600,7 +600,7 @@
         <w:pStyle w:val="ListParagraph"/>
         <w:numPr>
           <w:ilvl w:val="0"/>
-          <w:numId w:val="1"/>
+          <w:numId w:val="2"/>
         </w:numPr>
         <w:spacing w:before="0" w:after="60"/>
         <w:rPr/>
@@ -675,7 +675,7 @@
         <w:pStyle w:val="ListParagraph"/>
         <w:numPr>
           <w:ilvl w:val="0"/>
-          <w:numId w:val="1"/>
+          <w:numId w:val="2"/>
         </w:numPr>
         <w:spacing w:before="0" w:after="60"/>
         <w:rPr/>
@@ -694,7 +694,7 @@
         <w:pStyle w:val="ListParagraph"/>
         <w:numPr>
           <w:ilvl w:val="0"/>
-          <w:numId w:val="1"/>
+          <w:numId w:val="2"/>
         </w:numPr>
         <w:spacing w:before="0" w:after="60"/>
         <w:rPr/>
@@ -713,7 +713,7 @@
         <w:pStyle w:val="ListParagraph"/>
         <w:numPr>
           <w:ilvl w:val="0"/>
-          <w:numId w:val="1"/>
+          <w:numId w:val="2"/>
         </w:numPr>
         <w:spacing w:before="0" w:after="60"/>
         <w:rPr/>
@@ -732,7 +732,7 @@
         <w:pStyle w:val="ListParagraph"/>
         <w:numPr>
           <w:ilvl w:val="0"/>
-          <w:numId w:val="1"/>
+          <w:numId w:val="2"/>
         </w:numPr>
         <w:spacing w:before="0" w:after="60"/>
         <w:rPr/>
@@ -786,7 +786,7 @@
         <w:pStyle w:val="ListParagraph"/>
         <w:numPr>
           <w:ilvl w:val="0"/>
-          <w:numId w:val="1"/>
+          <w:numId w:val="2"/>
         </w:numPr>
         <w:spacing w:before="0" w:after="60"/>
         <w:rPr/>
@@ -805,7 +805,7 @@
         <w:pStyle w:val="ListParagraph"/>
         <w:numPr>
           <w:ilvl w:val="0"/>
-          <w:numId w:val="1"/>
+          <w:numId w:val="2"/>
         </w:numPr>
         <w:spacing w:before="0" w:after="60"/>
         <w:rPr/>
@@ -824,10 +824,14 @@
         <w:pStyle w:val="ListParagraph"/>
         <w:numPr>
           <w:ilvl w:val="0"/>
-          <w:numId w:val="1"/>
-        </w:numPr>
-        <w:spacing w:before="0" w:after="60"/>
-        <w:rPr/>
+          <w:numId w:val="2"/>
+        </w:numPr>
+        <w:spacing w:before="0" w:after="60"/>
+        <w:rPr>
+          <w:rFonts w:ascii="Calibri" w:hAnsi="Calibri" w:eastAsia="Calibri" w:cs="Calibri"/>
+          <w:sz w:val="20"/>
+          <w:szCs w:val="20"/>
+        </w:rPr>
       </w:pPr>
       <w:r>
         <w:rPr>
@@ -836,6 +840,29 @@
           <w:szCs w:val="20"/>
         </w:rPr>
         <w:t>Co-developed a game in Godot for use in hands-on workshops teaching members foundational game design and development techniques. (GitHub: Brian0706/GDDC_Example_Game)</w:t>
+      </w:r>
+    </w:p>
+    <w:p>
+      <w:pPr>
+        <w:pStyle w:val="ListParagraph"/>
+        <w:numPr>
+          <w:ilvl w:val="0"/>
+          <w:numId w:val="2"/>
+        </w:numPr>
+        <w:spacing w:before="0" w:after="60"/>
+        <w:rPr>
+          <w:rFonts w:ascii="Calibri" w:hAnsi="Calibri" w:eastAsia="Calibri" w:cs="Calibri"/>
+          <w:sz w:val="20"/>
+          <w:szCs w:val="20"/>
+        </w:rPr>
+      </w:pPr>
+      <w:r>
+        <w:rPr>
+          <w:rFonts w:eastAsia="Calibri" w:cs="Calibri" w:ascii="Calibri" w:hAnsi="Calibri"/>
+          <w:sz w:val="20"/>
+          <w:szCs w:val="20"/>
+        </w:rPr>
+        <w:t>Presented a funding request, budget breakdown, and project proposal to USG Senators using PowerPoint and Excel, successfully securing WEEE grant funding on top of managing the club's ~$1,000 annual budget.</w:t>
       </w:r>
     </w:p>
     <w:p>
@@ -878,7 +905,7 @@
         <w:pStyle w:val="ListParagraph"/>
         <w:numPr>
           <w:ilvl w:val="0"/>
-          <w:numId w:val="1"/>
+          <w:numId w:val="2"/>
         </w:numPr>
         <w:spacing w:before="0" w:after="60"/>
         <w:rPr/>
@@ -897,7 +924,7 @@
         <w:pStyle w:val="ListParagraph"/>
         <w:numPr>
           <w:ilvl w:val="0"/>
-          <w:numId w:val="1"/>
+          <w:numId w:val="2"/>
         </w:numPr>
         <w:spacing w:before="0" w:after="60"/>
         <w:rPr/>
@@ -962,7 +989,7 @@
         <w:pStyle w:val="ListParagraph"/>
         <w:numPr>
           <w:ilvl w:val="0"/>
-          <w:numId w:val="1"/>
+          <w:numId w:val="2"/>
         </w:numPr>
         <w:spacing w:before="0" w:after="60"/>
         <w:rPr/>
@@ -981,7 +1008,7 @@
         <w:pStyle w:val="ListParagraph"/>
         <w:numPr>
           <w:ilvl w:val="0"/>
-          <w:numId w:val="1"/>
+          <w:numId w:val="2"/>
         </w:numPr>
         <w:spacing w:before="0" w:after="60"/>
         <w:rPr/>
@@ -1021,7 +1048,7 @@
         <w:pStyle w:val="ListParagraph"/>
         <w:numPr>
           <w:ilvl w:val="0"/>
-          <w:numId w:val="1"/>
+          <w:numId w:val="2"/>
         </w:numPr>
         <w:spacing w:before="0" w:after="60"/>
         <w:rPr/>
@@ -1040,7 +1067,7 @@
         <w:pStyle w:val="ListParagraph"/>
         <w:numPr>
           <w:ilvl w:val="0"/>
-          <w:numId w:val="1"/>
+          <w:numId w:val="2"/>
         </w:numPr>
         <w:spacing w:before="0" w:after="60"/>
         <w:rPr/>
@@ -1059,7 +1086,7 @@
         <w:pStyle w:val="ListParagraph"/>
         <w:numPr>
           <w:ilvl w:val="0"/>
-          <w:numId w:val="1"/>
+          <w:numId w:val="2"/>
         </w:numPr>
         <w:spacing w:before="0" w:after="60"/>
         <w:rPr/>
@@ -1078,7 +1105,7 @@
         <w:pStyle w:val="ListParagraph"/>
         <w:numPr>
           <w:ilvl w:val="0"/>
-          <w:numId w:val="1"/>
+          <w:numId w:val="2"/>
         </w:numPr>
         <w:spacing w:before="0" w:after="60"/>
         <w:rPr/>
@@ -1122,7 +1149,7 @@
         <w:pStyle w:val="ListParagraph"/>
         <w:numPr>
           <w:ilvl w:val="0"/>
-          <w:numId w:val="1"/>
+          <w:numId w:val="2"/>
         </w:numPr>
         <w:spacing w:before="0" w:after="60"/>
         <w:rPr/>
@@ -1141,7 +1168,7 @@
         <w:pStyle w:val="ListParagraph"/>
         <w:numPr>
           <w:ilvl w:val="0"/>
-          <w:numId w:val="1"/>
+          <w:numId w:val="2"/>
         </w:numPr>
         <w:spacing w:before="0" w:after="60"/>
         <w:rPr/>
@@ -1160,7 +1187,7 @@
         <w:pStyle w:val="ListParagraph"/>
         <w:numPr>
           <w:ilvl w:val="0"/>
-          <w:numId w:val="1"/>
+          <w:numId w:val="2"/>
         </w:numPr>
         <w:spacing w:before="0" w:after="60"/>
         <w:rPr>
@@ -1439,6 +1466,143 @@
   <w:abstractNum w:abstractNumId="2">
     <w:lvl w:ilvl="0">
       <w:start w:val="1"/>
+      <w:numFmt w:val="bullet"/>
+      <w:lvlText w:val=""/>
+      <w:lvlJc w:val="start"/>
+      <w:pPr>
+        <w:tabs>
+          <w:tab w:val="num" w:pos="0"/>
+        </w:tabs>
+        <w:ind w:start="720" w:hanging="360"/>
+      </w:pPr>
+      <w:rPr>
+        <w:rFonts w:ascii="Wingdings" w:hAnsi="Wingdings" w:cs="Wingdings" w:hint="default"/>
+      </w:rPr>
+    </w:lvl>
+    <w:lvl w:ilvl="1">
+      <w:start w:val="1"/>
+      <w:numFmt w:val="bullet"/>
+      <w:lvlText w:val=""/>
+      <w:lvlJc w:val="start"/>
+      <w:pPr>
+        <w:tabs>
+          <w:tab w:val="num" w:pos="0"/>
+        </w:tabs>
+        <w:ind w:start="1440" w:hanging="360"/>
+      </w:pPr>
+      <w:rPr>
+        <w:rFonts w:ascii="Wingdings 2" w:hAnsi="Wingdings 2" w:cs="Wingdings 2" w:hint="default"/>
+      </w:rPr>
+    </w:lvl>
+    <w:lvl w:ilvl="2">
+      <w:start w:val="1"/>
+      <w:numFmt w:val="bullet"/>
+      <w:lvlText w:val="■"/>
+      <w:lvlJc w:val="start"/>
+      <w:pPr>
+        <w:tabs>
+          <w:tab w:val="num" w:pos="0"/>
+        </w:tabs>
+        <w:ind w:start="2160" w:hanging="360"/>
+      </w:pPr>
+      <w:rPr>
+        <w:rFonts w:ascii="OpenSymbol" w:hAnsi="OpenSymbol" w:cs="OpenSymbol" w:hint="default"/>
+      </w:rPr>
+    </w:lvl>
+    <w:lvl w:ilvl="3">
+      <w:start w:val="1"/>
+      <w:numFmt w:val="bullet"/>
+      <w:lvlText w:val=""/>
+      <w:lvlJc w:val="start"/>
+      <w:pPr>
+        <w:tabs>
+          <w:tab w:val="num" w:pos="0"/>
+        </w:tabs>
+        <w:ind w:start="2880" w:hanging="360"/>
+      </w:pPr>
+      <w:rPr>
+        <w:rFonts w:ascii="Wingdings" w:hAnsi="Wingdings" w:cs="Wingdings" w:hint="default"/>
+      </w:rPr>
+    </w:lvl>
+    <w:lvl w:ilvl="4">
+      <w:start w:val="1"/>
+      <w:numFmt w:val="bullet"/>
+      <w:lvlText w:val=""/>
+      <w:lvlJc w:val="start"/>
+      <w:pPr>
+        <w:tabs>
+          <w:tab w:val="num" w:pos="0"/>
+        </w:tabs>
+        <w:ind w:start="3600" w:hanging="360"/>
+      </w:pPr>
+      <w:rPr>
+        <w:rFonts w:ascii="Wingdings 2" w:hAnsi="Wingdings 2" w:cs="Wingdings 2" w:hint="default"/>
+      </w:rPr>
+    </w:lvl>
+    <w:lvl w:ilvl="5">
+      <w:start w:val="1"/>
+      <w:numFmt w:val="bullet"/>
+      <w:lvlText w:val="■"/>
+      <w:lvlJc w:val="start"/>
+      <w:pPr>
+        <w:tabs>
+          <w:tab w:val="num" w:pos="0"/>
+        </w:tabs>
+        <w:ind w:start="4320" w:hanging="360"/>
+      </w:pPr>
+      <w:rPr>
+        <w:rFonts w:ascii="OpenSymbol" w:hAnsi="OpenSymbol" w:cs="OpenSymbol" w:hint="default"/>
+      </w:rPr>
+    </w:lvl>
+    <w:lvl w:ilvl="6">
+      <w:start w:val="1"/>
+      <w:numFmt w:val="bullet"/>
+      <w:lvlText w:val=""/>
+      <w:lvlJc w:val="start"/>
+      <w:pPr>
+        <w:tabs>
+          <w:tab w:val="num" w:pos="0"/>
+        </w:tabs>
+        <w:ind w:start="5040" w:hanging="360"/>
+      </w:pPr>
+      <w:rPr>
+        <w:rFonts w:ascii="Wingdings" w:hAnsi="Wingdings" w:cs="Wingdings" w:hint="default"/>
+      </w:rPr>
+    </w:lvl>
+    <w:lvl w:ilvl="7">
+      <w:start w:val="1"/>
+      <w:numFmt w:val="bullet"/>
+      <w:lvlText w:val=""/>
+      <w:lvlJc w:val="start"/>
+      <w:pPr>
+        <w:tabs>
+          <w:tab w:val="num" w:pos="0"/>
+        </w:tabs>
+        <w:ind w:start="5760" w:hanging="360"/>
+      </w:pPr>
+      <w:rPr>
+        <w:rFonts w:ascii="Wingdings" w:hAnsi="Wingdings" w:cs="Wingdings" w:hint="default"/>
+      </w:rPr>
+    </w:lvl>
+    <w:lvl w:ilvl="8">
+      <w:start w:val="1"/>
+      <w:numFmt w:val="bullet"/>
+      <w:lvlText w:val=""/>
+      <w:lvlJc w:val="start"/>
+      <w:pPr>
+        <w:tabs>
+          <w:tab w:val="num" w:pos="0"/>
+        </w:tabs>
+        <w:ind w:start="6480" w:hanging="360"/>
+      </w:pPr>
+      <w:rPr>
+        <w:rFonts w:ascii="Wingdings" w:hAnsi="Wingdings" w:cs="Wingdings" w:hint="default"/>
+      </w:rPr>
+    </w:lvl>
+  </w:abstractNum>
+  <w:abstractNum w:abstractNumId="3">
+    <w:lvl w:ilvl="0">
+      <w:start w:val="1"/>
       <w:numFmt w:val="none"/>
       <w:suff w:val="nothing"/>
       <w:lvlText w:val=""/>
@@ -1562,7 +1726,10 @@
     <w:abstractNumId w:val="2"/>
   </w:num>
   <w:num w:numId="3">
-    <w:abstractNumId w:val="1"/>
+    <w:abstractNumId w:val="3"/>
+  </w:num>
+  <w:num w:numId="4">
+    <w:abstractNumId w:val="2"/>
     <w:lvlOverride w:ilvl="0">
       <w:startOverride w:val="1"/>
     </w:lvlOverride>
@@ -1590,6 +1757,7 @@
     <w:qFormat/>
     <w:pPr>
       <w:widowControl/>
+      <w:suppressAutoHyphens w:val="true"/>
       <w:bidi w:val="0"/>
       <w:spacing w:before="0" w:after="0"/>
       <w:jc w:val="start"/>
@@ -1674,11 +1842,18 @@
       <w:u w:val="single"/>
     </w:rPr>
   </w:style>
-  <w:style w:type="character" w:styleId="FootnoteCharacters">
-    <w:name w:val="Footnote Characters"/>
+  <w:style w:type="character" w:styleId="FootnoteCharactersuser">
+    <w:name w:val="Footnote Characters (user)"/>
     <w:uiPriority w:val="99"/>
     <w:semiHidden/>
     <w:unhideWhenUsed/>
+    <w:qFormat/>
+    <w:rPr>
+      <w:vertAlign w:val="superscript"/>
+    </w:rPr>
+  </w:style>
+  <w:style w:type="character" w:styleId="FootnoteCharacters">
+    <w:name w:val="Footnote Characters"/>
     <w:qFormat/>
     <w:rPr>
       <w:vertAlign w:val="superscript"/>
@@ -1702,11 +1877,18 @@
       <w:szCs w:val="20"/>
     </w:rPr>
   </w:style>
-  <w:style w:type="character" w:styleId="EndnoteCharacters">
-    <w:name w:val="Endnote Characters"/>
+  <w:style w:type="character" w:styleId="EndnoteCharactersuser">
+    <w:name w:val="Endnote Characters (user)"/>
     <w:uiPriority w:val="99"/>
     <w:semiHidden/>
     <w:unhideWhenUsed/>
+    <w:qFormat/>
+    <w:rPr>
+      <w:vertAlign w:val="superscript"/>
+    </w:rPr>
+  </w:style>
+  <w:style w:type="character" w:styleId="EndnoteCharacters">
+    <w:name w:val="Endnote Characters"/>
     <w:qFormat/>
     <w:rPr>
       <w:vertAlign w:val="superscript"/>
@@ -1803,6 +1985,7 @@
     <w:qFormat/>
     <w:pPr>
       <w:widowControl/>
+      <w:suppressAutoHyphens w:val="true"/>
       <w:bidi w:val="0"/>
       <w:spacing w:before="0" w:after="0"/>
       <w:jc w:val="start"/>
@@ -1823,6 +2006,7 @@
     <w:qFormat/>
     <w:pPr>
       <w:widowControl/>
+      <w:suppressAutoHyphens w:val="true"/>
       <w:bidi w:val="0"/>
       <w:spacing w:before="0" w:after="0"/>
       <w:jc w:val="start"/>

</xml_diff>